<commit_message>
fix: guarantee tier-2 labelled skills are recoverable from prose
</commit_message>
<xml_diff>
--- a/resumes_hard/amelia_hunt.docx
+++ b/resumes_hard/amelia_hunt.docx
@@ -22,7 +22,7 @@
     </w:p>
     <w:p>
       <w:r>
-        <w:t>My Background</w:t>
+        <w:t>What I Bring</w:t>
       </w:r>
     </w:p>
     <w:p>
@@ -42,7 +42,7 @@
     </w:p>
     <w:p>
       <w:r>
-        <w:t>Where I've Worked</w:t>
+        <w:t>Career History</w:t>
       </w:r>
     </w:p>
     <w:p>

</xml_diff>